<commit_message>
Fix major bug: refactor CSUTLDTC.cbl (remove dead/commented code, correct CEEDAYS logic and error messages, eliminate placeholder style issues), remove unused CSLKPCDY.cpy, update CARDDEMO_ISSUES.md to reflect resolution, validate with doc generation and scripts
</commit_message>
<xml_diff>
--- a/carddemo-repo-summary.docx
+++ b/carddemo-repo-summary.docx
@@ -304,6 +304,43 @@
 
 <file path=word/comments.xml><?xml version="1.0" encoding="utf-8"?>
 <w:comments xmlns:cx="http://schemas.microsoft.com/office/drawing/2014/chartex" xmlns:cx1="http://schemas.microsoft.com/office/drawing/2015/9/8/chartex" xmlns:cx2="http://schemas.microsoft.com/office/drawing/2015/10/21/chartex" xmlns:cx3="http://schemas.microsoft.com/office/drawing/2016/5/9/chartex" xmlns:cx4="http://schemas.microsoft.com/office/drawing/2016/5/10/chartex" xmlns:cx5="http://schemas.microsoft.com/office/drawing/2016/5/11/chartex" xmlns:cx6="http://schemas.microsoft.com/office/drawing/2016/5/12/chartex" xmlns:cx7="http://schemas.microsoft.com/office/drawing/2016/5/13/chartex" xmlns:cx8="http://schemas.microsoft.com/office/drawing/2016/5/14/chartex" xmlns:mc="http://schemas.openxmlformats.org/markup-compatibility/2006" xmlns:aink="http://schemas.microsoft.com/office/drawing/2016/ink" xmlns:am3d="http://schemas.microsoft.com/office/drawing/2017/model3d" xmlns:o="urn:schemas-microsoft-com:office:office" xmlns:r="http://schemas.openxmlformats.org/officeDocument/2006/relationships" xmlns:m="http://schemas.openxmlformats.org/officeDocument/2006/math" xmlns:v="urn:schemas-microsoft-com:vml" xmlns:wp14="http://schemas.microsoft.com/office/word/2010/wordprocessingDrawing" xmlns:wp="http://schemas.openxmlformats.org/drawingml/2006/wordprocessingDrawing" xmlns:w10="urn:schemas-microsoft-com:office:word" xmlns:w="http://schemas.openxmlformats.org/wordprocessingml/2006/main" xmlns:w14="http://schemas.microsoft.com/office/word/2010/wordml" xmlns:w15="http://schemas.microsoft.com/office/word/2012/wordml" xmlns:w16cex="http://schemas.microsoft.com/office/word/2018/wordml/cex" xmlns:w16cid="http://schemas.microsoft.com/office/word/2016/wordml/cid" xmlns:w16="http://schemas.microsoft.com/office/word/2018/wordml" xmlns:w16sdtdh="http://schemas.microsoft.com/office/word/2020/wordml/sdtdatahash" xmlns:w16se="http://schemas.microsoft.com/office/word/2015/wordml/symex" xmlns:wpg="http://schemas.microsoft.com/office/word/2010/wordprocessingGroup" xmlns:wpi="http://schemas.microsoft.com/office/word/2010/wordprocessingInk" xmlns:wne="http://schemas.microsoft.com/office/word/2006/wordml" xmlns:wps="http://schemas.microsoft.com/office/word/2010/wordprocessingShape"/>
+</file>
+
+<file path=word/endnotes.xml><?xml version="1.0" encoding="utf-8"?>
+<w:endnotes xmlns:wpc="http://schemas.microsoft.com/office/word/2010/wordprocessingCanvas" xmlns:mc="http://schemas.openxmlformats.org/markup-compatibility/2006" xmlns:o="urn:schemas-microsoft-com:office:office" xmlns:r="http://schemas.openxmlformats.org/officeDocument/2006/relationships" xmlns:m="http://schemas.openxmlformats.org/officeDocument/2006/math" xmlns:v="urn:schemas-microsoft-com:vml" xmlns:wp14="http://schemas.microsoft.com/office/word/2010/wordprocessingDrawing" xmlns:wp="http://schemas.openxmlformats.org/drawingml/2006/wordprocessingDrawing" xmlns:w10="urn:schemas-microsoft-com:office:word" xmlns:w="http://schemas.openxmlformats.org/wordprocessingml/2006/main" xmlns:w14="http://schemas.microsoft.com/office/word/2010/wordml" xmlns:w15="http://schemas.microsoft.com/office/word/2012/wordml" xmlns:wpg="http://schemas.microsoft.com/office/word/2010/wordprocessingGroup" xmlns:wpi="http://schemas.microsoft.com/office/word/2010/wordprocessingInk" xmlns:wne="http://schemas.microsoft.com/office/word/2006/wordml" xmlns:wps="http://schemas.microsoft.com/office/word/2010/wordprocessingShape" mc:Ignorable="w14 w15 wp14">
+  <w:endnote w:type="separator" w:id="-1">
+    <w:p>
+      <w:pPr>
+        <w:spacing w:after="0" w:line="240" w:lineRule="auto"/>
+      </w:pPr>
+      <w:r>
+        <w:rPr>
+          <w:rStyle w:val="EndnoteReference"/>
+        </w:rPr>
+        <w:endnoteRef/>
+      </w:r>
+      <w:r>
+        <w:separator/>
+      </w:r>
+    </w:p>
+  </w:endnote>
+  <w:endnote w:type="continuationSeparator" w:id="0">
+    <w:p>
+      <w:pPr>
+        <w:spacing w:after="0" w:line="240" w:lineRule="auto"/>
+      </w:pPr>
+      <w:r>
+        <w:rPr>
+          <w:rStyle w:val="EndnoteReference"/>
+        </w:rPr>
+        <w:endnoteRef/>
+      </w:r>
+      <w:r>
+        <w:continuationSeparator/>
+      </w:r>
+    </w:p>
+  </w:endnote>
+</w:endnotes>
 </file>
 
 <file path=word/footnotes.xml><?xml version="1.0" encoding="utf-8"?>
@@ -537,8 +574,8 @@
     <w:uiPriority w:val="99"/>
     <w:unhideWhenUsed/>
     <w:rPr>
+      <w:color w:val="0563C1"/>
       <w:u w:val="single"/>
-      <w:color w:val="0563C1"/>
     </w:rPr>
   </w:style>
   <w:style w:type="character" w:styleId="FootnoteReference">
@@ -578,5 +615,42 @@
       <w:szCs w:val="20"/>
     </w:rPr>
   </w:style>
+  <w:style w:type="character" w:styleId="EndnoteReference">
+    <w:name w:val="endnote reference"/>
+    <w:basedOn w:val="DefaultParagraphFont"/>
+    <w:uiPriority w:val="99"/>
+    <w:semiHidden/>
+    <w:unhideWhenUsed/>
+    <w:rPr>
+      <w:vertAlign w:val="superscript"/>
+    </w:rPr>
+  </w:style>
+  <w:style w:type="paragraph" w:styleId="EndnoteText">
+    <w:name w:val="endnote text"/>
+    <w:basedOn w:val="Normal"/>
+    <w:link w:val="EndnoteTextChar"/>
+    <w:uiPriority w:val="99"/>
+    <w:semiHidden/>
+    <w:unhideWhenUsed/>
+    <w:pPr>
+      <w:spacing w:after="0" w:line="240" w:lineRule="auto"/>
+    </w:pPr>
+    <w:rPr>
+      <w:sz w:val="20"/>
+      <w:szCs w:val="20"/>
+    </w:rPr>
+  </w:style>
+  <w:style w:type="character" w:styleId="EndnoteTextChar">
+    <w:name w:val="Endnote Text Char"/>
+    <w:basedOn w:val="DefaultParagraphFont"/>
+    <w:link w:val="EndnoteText"/>
+    <w:uiPriority w:val="99"/>
+    <w:semiHidden/>
+    <w:unhideWhenUsed/>
+    <w:rPr>
+      <w:sz w:val="20"/>
+      <w:szCs w:val="20"/>
+    </w:rPr>
+  </w:style>
 </w:styles>
 </file>
</xml_diff>